<commit_message>
Update portfolio design, hero section, and light mode
</commit_message>
<xml_diff>
--- a/public/CV/CV - Wilsen Angelo Laisan.docx
+++ b/public/CV/CV - Wilsen Angelo Laisan.docx
@@ -1,6 +1,6 @@
 
 <file path=word/document.xml><?xml version="1.0" encoding="utf-8"?>
-<w:document xmlns:wpc="http://schemas.microsoft.com/office/word/2010/wordprocessingCanvas" xmlns:cx="http://schemas.microsoft.com/office/drawing/2014/chartex" xmlns:cx1="http://schemas.microsoft.com/office/drawing/2015/9/8/chartex" xmlns:cx2="http://schemas.microsoft.com/office/drawing/2015/10/21/chartex" xmlns:cx3="http://schemas.microsoft.com/office/drawing/2016/5/9/chartex" xmlns:cx4="http://schemas.microsoft.com/office/drawing/2016/5/10/chartex" xmlns:cx5="http://schemas.microsoft.com/office/drawing/2016/5/11/chartex" xmlns:cx6="http://schemas.microsoft.com/office/drawing/2016/5/12/chartex" xmlns:cx7="http://schemas.microsoft.com/office/drawing/2016/5/13/chartex" xmlns:cx8="http://schemas.microsoft.com/office/drawing/2016/5/14/chartex" xmlns:mc="http://schemas.openxmlformats.org/markup-compatibility/2006" xmlns:aink="http://schemas.microsoft.com/office/drawing/2016/ink" xmlns:am3d="http://schemas.microsoft.com/office/drawing/2017/model3d" xmlns:o="urn:schemas-microsoft-com:office:office" xmlns:oel="http://schemas.microsoft.com/office/2019/extlst" xmlns:r="http://schemas.openxmlformats.org/officeDocument/2006/relationships" xmlns:m="http://schemas.openxmlformats.org/officeDocument/2006/math" xmlns:v="urn:schemas-microsoft-com:vml" xmlns:wp14="http://schemas.microsoft.com/office/word/2010/wordprocessingDrawing" xmlns:wp="http://schemas.openxmlformats.org/drawingml/2006/wordprocessingDrawing" xmlns:w10="urn:schemas-microsoft-com:office:word" xmlns:w="http://schemas.openxmlformats.org/wordprocessingml/2006/main" xmlns:w14="http://schemas.microsoft.com/office/word/2010/wordml" xmlns:w15="http://schemas.microsoft.com/office/word/2012/wordml" xmlns:w16cex="http://schemas.microsoft.com/office/word/2018/wordml/cex" xmlns:w16cid="http://schemas.microsoft.com/office/word/2016/wordml/cid" xmlns:w16="http://schemas.microsoft.com/office/word/2018/wordml" xmlns:w16du="http://schemas.microsoft.com/office/word/2023/wordml/word16du" xmlns:w16sdtdh="http://schemas.microsoft.com/office/word/2020/wordml/sdtdatahash" xmlns:w16sdtfl="http://schemas.microsoft.com/office/word/2024/wordml/sdtformatlock" xmlns:w16se="http://schemas.microsoft.com/office/word/2015/wordml/symex" xmlns:wpg="http://schemas.microsoft.com/office/word/2010/wordprocessingGroup" xmlns:wpi="http://schemas.microsoft.com/office/word/2010/wordprocessingInk" xmlns:wne="http://schemas.microsoft.com/office/word/2006/wordml" xmlns:wps="http://schemas.microsoft.com/office/word/2010/wordprocessingShape" mc:Ignorable="w14 w15 w16se w16cid w16 w16cex w16sdtdh w16sdtfl w16du wp14">
+<w:document xmlns:wpc="http://schemas.microsoft.com/office/word/2010/wordprocessingCanvas" xmlns:cx="http://schemas.microsoft.com/office/drawing/2014/chartex" xmlns:cx1="http://schemas.microsoft.com/office/drawing/2015/9/8/chartex" xmlns:cx2="http://schemas.microsoft.com/office/drawing/2015/10/21/chartex" xmlns:cx3="http://schemas.microsoft.com/office/drawing/2016/5/9/chartex" xmlns:cx4="http://schemas.microsoft.com/office/drawing/2016/5/10/chartex" xmlns:cx5="http://schemas.microsoft.com/office/drawing/2016/5/11/chartex" xmlns:cx6="http://schemas.microsoft.com/office/drawing/2016/5/12/chartex" xmlns:cx7="http://schemas.microsoft.com/office/drawing/2016/5/13/chartex" xmlns:cx8="http://schemas.microsoft.com/office/drawing/2016/5/14/chartex" xmlns:mc="http://schemas.openxmlformats.org/markup-compatibility/2006" xmlns:aink="http://schemas.microsoft.com/office/drawing/2016/ink" xmlns:am3d="http://schemas.microsoft.com/office/drawing/2017/model3d" xmlns:o="urn:schemas-microsoft-com:office:office" xmlns:oel="http://schemas.microsoft.com/office/2019/extlst" xmlns:r="http://schemas.openxmlformats.org/officeDocument/2006/relationships" xmlns:m="http://schemas.openxmlformats.org/officeDocument/2006/math" xmlns:v="urn:schemas-microsoft-com:vml" xmlns:wp14="http://schemas.microsoft.com/office/word/2010/wordprocessingDrawing" xmlns:wp="http://schemas.openxmlformats.org/drawingml/2006/wordprocessingDrawing" xmlns:w10="urn:schemas-microsoft-com:office:word" xmlns:w="http://schemas.openxmlformats.org/wordprocessingml/2006/main" xmlns:w14="http://schemas.microsoft.com/office/word/2010/wordml" xmlns:w15="http://schemas.microsoft.com/office/word/2012/wordml" xmlns:w16cei="http://schemas.microsoft.com/office/word/2026/wordml/cei" xmlns:w16cex="http://schemas.microsoft.com/office/word/2018/wordml/cex" xmlns:w16cid="http://schemas.microsoft.com/office/word/2016/wordml/cid" xmlns:w16="http://schemas.microsoft.com/office/word/2018/wordml" xmlns:w16du="http://schemas.microsoft.com/office/word/2023/wordml/word16du" xmlns:w16sdtdh="http://schemas.microsoft.com/office/word/2020/wordml/sdtdatahash" xmlns:w16sdtfl="http://schemas.microsoft.com/office/word/2024/wordml/sdtformatlock" xmlns:w16se="http://schemas.microsoft.com/office/word/2015/wordml/symex" xmlns:wpg="http://schemas.microsoft.com/office/word/2010/wordprocessingGroup" xmlns:wpi="http://schemas.microsoft.com/office/word/2010/wordprocessingInk" xmlns:wne="http://schemas.microsoft.com/office/word/2006/wordml" xmlns:wps="http://schemas.microsoft.com/office/word/2010/wordprocessingShape" mc:Ignorable="w14 w15 w16se w16cid w16 w16cex w16sdtdh w16sdtfl w16du wp14">
   <w:body>
     <w:p>
       <w:pPr>
@@ -678,8 +678,8 @@
         <w:tblLook w:val="01E0" w:firstRow="1" w:lastRow="1" w:firstColumn="1" w:lastColumn="1" w:noHBand="0" w:noVBand="0"/>
       </w:tblPr>
       <w:tblGrid>
-        <w:gridCol w:w="4857"/>
-        <w:gridCol w:w="5669"/>
+        <w:gridCol w:w="7538"/>
+        <w:gridCol w:w="2988"/>
       </w:tblGrid>
       <w:tr>
         <w:trPr>
@@ -687,7 +687,7 @@
         </w:trPr>
         <w:tc>
           <w:tcPr>
-            <w:tcW w:w="4857" w:type="dxa"/>
+            <w:tcW w:w="7538" w:type="dxa"/>
             <w:tcBorders>
               <w:top w:val="single" w:sz="12" w:space="0" w:color="000000"/>
             </w:tcBorders>
@@ -699,7 +699,7 @@
               <w:rPr>
                 <w:b/>
                 <w:bCs/>
-                <w:spacing w:val="-2"/>
+                <w:i/>
               </w:rPr>
             </w:pPr>
             <w:r>
@@ -708,17 +708,281 @@
                 <w:bCs/>
                 <w:i/>
               </w:rPr>
+              <w:t xml:space="preserve">PT Tera Multi Wahana </w:t>
+            </w:r>
+          </w:p>
+          <w:p>
+            <w:pPr>
+              <w:pStyle w:val="TableParagraph"/>
+              <w:spacing w:before="160"/>
+              <w:jc w:val="both"/>
+              <w:rPr>
+                <w:i/>
+              </w:rPr>
+            </w:pPr>
+            <w:r>
+              <w:rPr>
+                <w:i/>
+              </w:rPr>
+              <w:t>Full-Stack Application Developer &amp; IT Support</w:t>
+            </w:r>
+            <w:r>
+              <w:rPr>
+                <w:i/>
+              </w:rPr>
+              <w:t xml:space="preserve"> </w:t>
+            </w:r>
+            <w:r>
+              <w:rPr>
+                <w:i/>
+              </w:rPr>
+              <w:t>Intern</w:t>
+            </w:r>
+          </w:p>
+          <w:p>
+            <w:pPr>
+              <w:pStyle w:val="TableParagraph"/>
+              <w:numPr>
+                <w:ilvl w:val="0"/>
+                <w:numId w:val="2"/>
+              </w:numPr>
+              <w:spacing w:before="160"/>
+              <w:jc w:val="both"/>
+              <w:rPr>
+                <w:iCs/>
+                <w:sz w:val="20"/>
+                <w:szCs w:val="20"/>
+              </w:rPr>
+            </w:pPr>
+            <w:r>
+              <w:rPr>
+                <w:iCs/>
+                <w:sz w:val="20"/>
+                <w:szCs w:val="20"/>
+              </w:rPr>
+              <w:t>Developed and maintained full-stack enterprise applications, including Distribution Management Systems (DMS/Aglis) and Sales Force Automation (SFA) modules, using Flutter, C# .NET, and SQL Server.</w:t>
+            </w:r>
+          </w:p>
+          <w:p>
+            <w:pPr>
+              <w:pStyle w:val="TableParagraph"/>
+              <w:numPr>
+                <w:ilvl w:val="0"/>
+                <w:numId w:val="2"/>
+              </w:numPr>
+              <w:spacing w:before="160"/>
+              <w:jc w:val="both"/>
+              <w:rPr>
+                <w:iCs/>
+                <w:sz w:val="20"/>
+                <w:szCs w:val="20"/>
+              </w:rPr>
+            </w:pPr>
+            <w:r>
+              <w:rPr>
+                <w:iCs/>
+                <w:sz w:val="20"/>
+                <w:szCs w:val="20"/>
+              </w:rPr>
+              <w:t xml:space="preserve">Engineered core business logic, automated transactional workflows, and optimized database queries to streamline enterprise operations. </w:t>
+            </w:r>
+          </w:p>
+          <w:p>
+            <w:pPr>
+              <w:pStyle w:val="TableParagraph"/>
+              <w:numPr>
+                <w:ilvl w:val="0"/>
+                <w:numId w:val="2"/>
+              </w:numPr>
+              <w:spacing w:before="160"/>
+              <w:jc w:val="both"/>
+              <w:rPr>
+                <w:iCs/>
+                <w:sz w:val="20"/>
+                <w:szCs w:val="20"/>
+              </w:rPr>
+            </w:pPr>
+            <w:r>
+              <w:rPr>
+                <w:iCs/>
+                <w:sz w:val="20"/>
+                <w:szCs w:val="20"/>
+              </w:rPr>
+              <w:t>Acted as an IT Support Specialist, presenting system architectures and operational workflows directly to clients to facilitate smooth onboarding and online implementation</w:t>
+            </w:r>
+            <w:r>
+              <w:rPr>
+                <w:iCs/>
+                <w:sz w:val="20"/>
+                <w:szCs w:val="20"/>
+              </w:rPr>
+              <w:t>.</w:t>
+            </w:r>
+          </w:p>
+          <w:p>
+            <w:pPr>
+              <w:pStyle w:val="TableParagraph"/>
+              <w:numPr>
+                <w:ilvl w:val="0"/>
+                <w:numId w:val="2"/>
+              </w:numPr>
+              <w:spacing w:before="160"/>
+              <w:jc w:val="both"/>
+              <w:rPr>
+                <w:iCs/>
+                <w:sz w:val="20"/>
+                <w:szCs w:val="20"/>
+              </w:rPr>
+            </w:pPr>
+            <w:r>
+              <w:rPr>
+                <w:iCs/>
+                <w:sz w:val="20"/>
+                <w:szCs w:val="20"/>
+              </w:rPr>
+              <w:t>Performed production bug fixing, UI/UX refactoring, and API debugging to ensure system performance, reliability, and stability in live environments.</w:t>
+            </w:r>
+          </w:p>
+          <w:p>
+            <w:pPr>
+              <w:pStyle w:val="TableParagraph"/>
+              <w:spacing w:before="160"/>
+              <w:rPr>
+                <w:b/>
+                <w:bCs/>
+                <w:spacing w:val="-2"/>
+              </w:rPr>
+            </w:pPr>
+            <w:r>
+              <w:rPr>
+                <w:b/>
+                <w:bCs/>
+                <w:i/>
+              </w:rPr>
               <w:t>Pre-Training Program</w:t>
             </w:r>
           </w:p>
         </w:tc>
         <w:tc>
           <w:tcPr>
-            <w:tcW w:w="5669" w:type="dxa"/>
+            <w:tcW w:w="2988" w:type="dxa"/>
             <w:tcBorders>
               <w:top w:val="single" w:sz="12" w:space="0" w:color="000000"/>
             </w:tcBorders>
           </w:tcPr>
+          <w:p>
+            <w:pPr>
+              <w:pStyle w:val="TableParagraph"/>
+              <w:spacing w:before="160"/>
+              <w:ind w:left="0" w:right="157"/>
+              <w:jc w:val="right"/>
+              <w:rPr>
+                <w:iCs/>
+              </w:rPr>
+            </w:pPr>
+            <w:r>
+              <w:rPr>
+                <w:iCs/>
+              </w:rPr>
+              <w:t>Jakarta</w:t>
+            </w:r>
+          </w:p>
+          <w:p>
+            <w:pPr>
+              <w:pStyle w:val="TableParagraph"/>
+              <w:spacing w:before="160"/>
+              <w:ind w:left="0" w:right="157"/>
+              <w:jc w:val="right"/>
+              <w:rPr>
+                <w:sz w:val="20"/>
+                <w:szCs w:val="20"/>
+              </w:rPr>
+            </w:pPr>
+            <w:r>
+              <w:rPr>
+                <w:sz w:val="20"/>
+                <w:szCs w:val="20"/>
+              </w:rPr>
+              <w:t xml:space="preserve">Februari 2026 – </w:t>
+            </w:r>
+            <w:r>
+              <w:rPr>
+                <w:sz w:val="20"/>
+                <w:szCs w:val="20"/>
+              </w:rPr>
+              <w:t xml:space="preserve">Februari </w:t>
+            </w:r>
+            <w:r>
+              <w:rPr>
+                <w:sz w:val="20"/>
+                <w:szCs w:val="20"/>
+              </w:rPr>
+              <w:t>202</w:t>
+            </w:r>
+            <w:r>
+              <w:rPr>
+                <w:sz w:val="20"/>
+                <w:szCs w:val="20"/>
+              </w:rPr>
+              <w:t>7</w:t>
+            </w:r>
+          </w:p>
+          <w:p>
+            <w:pPr>
+              <w:pStyle w:val="TableParagraph"/>
+              <w:spacing w:before="160"/>
+              <w:ind w:left="0" w:right="157"/>
+              <w:jc w:val="right"/>
+            </w:pPr>
+          </w:p>
+          <w:p>
+            <w:pPr>
+              <w:pStyle w:val="TableParagraph"/>
+              <w:spacing w:before="160"/>
+              <w:ind w:left="0" w:right="157"/>
+              <w:jc w:val="right"/>
+            </w:pPr>
+          </w:p>
+          <w:p>
+            <w:pPr>
+              <w:pStyle w:val="TableParagraph"/>
+              <w:spacing w:before="160"/>
+              <w:ind w:left="0" w:right="157"/>
+              <w:jc w:val="right"/>
+            </w:pPr>
+          </w:p>
+          <w:p>
+            <w:pPr>
+              <w:pStyle w:val="TableParagraph"/>
+              <w:spacing w:before="160"/>
+              <w:ind w:left="0" w:right="157"/>
+              <w:jc w:val="right"/>
+            </w:pPr>
+          </w:p>
+          <w:p>
+            <w:pPr>
+              <w:pStyle w:val="TableParagraph"/>
+              <w:spacing w:before="160"/>
+              <w:ind w:left="0" w:right="157"/>
+              <w:jc w:val="right"/>
+            </w:pPr>
+          </w:p>
+          <w:p>
+            <w:pPr>
+              <w:pStyle w:val="TableParagraph"/>
+              <w:spacing w:before="160"/>
+              <w:ind w:left="0" w:right="157"/>
+              <w:jc w:val="right"/>
+            </w:pPr>
+          </w:p>
+          <w:p>
+            <w:pPr>
+              <w:pStyle w:val="TableParagraph"/>
+              <w:spacing w:before="160"/>
+              <w:ind w:left="0" w:right="157"/>
+              <w:jc w:val="right"/>
+            </w:pPr>
+          </w:p>
           <w:p>
             <w:pPr>
               <w:pStyle w:val="TableParagraph"/>
@@ -738,7 +1002,7 @@
         </w:trPr>
         <w:tc>
           <w:tcPr>
-            <w:tcW w:w="4857" w:type="dxa"/>
+            <w:tcW w:w="7538" w:type="dxa"/>
           </w:tcPr>
           <w:p>
             <w:pPr>
@@ -754,45 +1018,13 @@
                 <w:i/>
                 <w:sz w:val="20"/>
               </w:rPr>
-              <w:t xml:space="preserve">Pre-Training </w:t>
-            </w:r>
-            <w:proofErr w:type="spellStart"/>
-            <w:r>
-              <w:rPr>
-                <w:i/>
-                <w:sz w:val="20"/>
-              </w:rPr>
-              <w:t>Asistant</w:t>
-            </w:r>
-            <w:proofErr w:type="spellEnd"/>
-            <w:r>
-              <w:rPr>
-                <w:i/>
-                <w:sz w:val="20"/>
-              </w:rPr>
-              <w:t xml:space="preserve"> </w:t>
-            </w:r>
-            <w:proofErr w:type="spellStart"/>
-            <w:r>
-              <w:rPr>
-                <w:i/>
-                <w:sz w:val="20"/>
-              </w:rPr>
-              <w:t>Laboratorium</w:t>
-            </w:r>
-            <w:proofErr w:type="spellEnd"/>
-            <w:r>
-              <w:rPr>
-                <w:i/>
-                <w:sz w:val="20"/>
-              </w:rPr>
-              <w:t xml:space="preserve"> BINUS University</w:t>
+              <w:t>Pre-Training Asistant Laboratorium BINUS University</w:t>
             </w:r>
           </w:p>
         </w:tc>
         <w:tc>
           <w:tcPr>
-            <w:tcW w:w="5669" w:type="dxa"/>
+            <w:tcW w:w="2988" w:type="dxa"/>
           </w:tcPr>
           <w:p>
             <w:pPr>
@@ -1240,14 +1472,12 @@
                 <w:sz w:val="20"/>
               </w:rPr>
             </w:pPr>
-            <w:proofErr w:type="spellStart"/>
             <w:r>
               <w:rPr>
                 <w:sz w:val="20"/>
               </w:rPr>
               <w:t>Februari</w:t>
             </w:r>
-            <w:proofErr w:type="spellEnd"/>
             <w:r>
               <w:rPr>
                 <w:spacing w:val="56"/>
@@ -1351,6 +1581,17 @@
         </w:rPr>
         <w:t>.</w:t>
       </w:r>
+    </w:p>
+    <w:p>
+      <w:pPr>
+        <w:tabs>
+          <w:tab w:val="left" w:pos="1132"/>
+        </w:tabs>
+        <w:ind w:left="771"/>
+        <w:rPr>
+          <w:sz w:val="20"/>
+        </w:rPr>
+      </w:pPr>
     </w:p>
     <w:p>
       <w:pPr>
@@ -1421,8 +1662,8 @@
         <w:tblLook w:val="01E0" w:firstRow="1" w:lastRow="1" w:firstColumn="1" w:lastColumn="1" w:noHBand="0" w:noVBand="0"/>
       </w:tblPr>
       <w:tblGrid>
-        <w:gridCol w:w="5808"/>
-        <w:gridCol w:w="4719"/>
+        <w:gridCol w:w="7113"/>
+        <w:gridCol w:w="3414"/>
       </w:tblGrid>
       <w:tr>
         <w:trPr>
@@ -1430,7 +1671,7 @@
         </w:trPr>
         <w:tc>
           <w:tcPr>
-            <w:tcW w:w="5808" w:type="dxa"/>
+            <w:tcW w:w="7113" w:type="dxa"/>
             <w:tcBorders>
               <w:top w:val="single" w:sz="12" w:space="0" w:color="000000"/>
             </w:tcBorders>
@@ -1472,7 +1713,7 @@
         </w:tc>
         <w:tc>
           <w:tcPr>
-            <w:tcW w:w="4719" w:type="dxa"/>
+            <w:tcW w:w="3414" w:type="dxa"/>
             <w:tcBorders>
               <w:top w:val="single" w:sz="12" w:space="0" w:color="000000"/>
             </w:tcBorders>
@@ -1521,24 +1762,19 @@
       <w:r>
         <w:t xml:space="preserve">I developed an Android application called </w:t>
       </w:r>
-      <w:proofErr w:type="spellStart"/>
       <w:r>
         <w:rPr>
           <w:i/>
           <w:iCs/>
         </w:rPr>
-        <w:t>DoJo</w:t>
-      </w:r>
-      <w:proofErr w:type="spellEnd"/>
-      <w:r>
-        <w:rPr>
-          <w:i/>
-          <w:iCs/>
-        </w:rPr>
-        <w:t xml:space="preserve"> Movie</w:t>
-      </w:r>
-      <w:r>
-        <w:t>, designed for browsing, viewing, and tracking movies. The app was built using Kotlin and includes features such as movie search, detailed movie information, and personalized watchlist tracking. Throughout the development process, I applied clean architecture principles, worked on UI/UX design, and integrated external APIs to deliver dynamic content. This project allowed me to strengthen my skills in mobile app development, testing, and performance optimization while gaining practical experience in building and deploying Android applications</w:t>
+        <w:t>DoJo Movie</w:t>
+      </w:r>
+      <w:r>
+        <w:t xml:space="preserve">, designed for browsing, viewing, and tracking movies. The app was </w:t>
+      </w:r>
+      <w:r>
+        <w:lastRenderedPageBreak/>
+        <w:t>built using Kotlin and includes features such as movie search, detailed movie information, and personalized watchlist tracking. Throughout the development process, I applied clean architecture principles, worked on UI/UX design, and integrated external APIs to deliver dynamic content. This project allowed me to strengthen my skills in mobile app development, testing, and performance optimization while gaining practical experience in building and deploying Android applications</w:t>
       </w:r>
       <w:r>
         <w:t>.</w:t>
@@ -1590,14 +1826,7 @@
               <w:rPr>
                 <w:b/>
               </w:rPr>
-              <w:t xml:space="preserve">Eira </w:t>
-            </w:r>
-            <w:proofErr w:type="gramStart"/>
-            <w:r>
-              <w:rPr>
-                <w:b/>
-              </w:rPr>
-              <w:t xml:space="preserve">Chatbot </w:t>
+              <w:t xml:space="preserve">Eira Chatbot </w:t>
             </w:r>
             <w:r>
               <w:rPr>
@@ -1610,15 +1839,7 @@
                 <w:i/>
                 <w:lang w:val="en-ID"/>
               </w:rPr>
-              <w:t>React</w:t>
-            </w:r>
-            <w:proofErr w:type="gramEnd"/>
-            <w:r>
-              <w:rPr>
-                <w:i/>
-                <w:lang w:val="en-ID"/>
-              </w:rPr>
-              <w:t xml:space="preserve"> Native, Node.js, MongoDB</w:t>
+              <w:t>React Native, Node.js, MongoDB</w:t>
             </w:r>
           </w:p>
           <w:p>
@@ -1798,14 +2019,7 @@
         <w:rPr>
           <w:spacing w:val="9"/>
         </w:rPr>
-        <w:t xml:space="preserve">Developed a music e-commerce app using Flutter and Node.js, featuring a song catalog, audio preview, and digital </w:t>
-      </w:r>
-      <w:r>
-        <w:rPr>
-          <w:spacing w:val="9"/>
-        </w:rPr>
-        <w:lastRenderedPageBreak/>
-        <w:t>purchase system.</w:t>
+        <w:t>Developed a music e-commerce app using Flutter and Node.js, featuring a song catalog, audio preview, and digital purchase system.</w:t>
       </w:r>
       <w:r>
         <w:rPr>
@@ -2160,27 +2374,73 @@
         <w:rPr>
           <w:spacing w:val="9"/>
         </w:rPr>
-        <w:t xml:space="preserve"> with </w:t>
-      </w:r>
-      <w:proofErr w:type="spellStart"/>
+        <w:t xml:space="preserve"> with TextMesh Pro to enhance the immersive experience</w:t>
+      </w:r>
       <w:r>
         <w:rPr>
           <w:spacing w:val="9"/>
         </w:rPr>
-        <w:t>TextMesh</w:t>
-      </w:r>
-      <w:proofErr w:type="spellEnd"/>
-      <w:r>
-        <w:rPr>
-          <w:spacing w:val="9"/>
-        </w:rPr>
-        <w:t xml:space="preserve"> Pro to enhance the immersive experience</w:t>
-      </w:r>
-      <w:r>
-        <w:rPr>
-          <w:spacing w:val="9"/>
-        </w:rPr>
         <w:t>.</w:t>
+      </w:r>
+    </w:p>
+    <w:p>
+      <w:pPr>
+        <w:pStyle w:val="BodyText"/>
+        <w:tabs>
+          <w:tab w:val="right" w:pos="10493"/>
+        </w:tabs>
+        <w:spacing w:before="128" w:line="360" w:lineRule="auto"/>
+        <w:ind w:left="424" w:right="257"/>
+        <w:jc w:val="both"/>
+        <w:rPr>
+          <w:i/>
+          <w:iCs/>
+        </w:rPr>
+      </w:pPr>
+      <w:r>
+        <w:rPr>
+          <w:b/>
+          <w:bCs/>
+          <w:sz w:val="22"/>
+          <w:szCs w:val="22"/>
+        </w:rPr>
+        <w:t>CryptoSen</w:t>
+      </w:r>
+      <w:r>
+        <w:t xml:space="preserve"> </w:t>
+      </w:r>
+      <w:r>
+        <w:rPr>
+          <w:b/>
+          <w:bCs/>
+          <w:i/>
+          <w:iCs/>
+        </w:rPr>
+        <w:t xml:space="preserve"> </w:t>
+      </w:r>
+      <w:r>
+        <w:rPr>
+          <w:i/>
+          <w:iCs/>
+          <w:sz w:val="22"/>
+          <w:szCs w:val="22"/>
+        </w:rPr>
+        <w:t xml:space="preserve">React Navitve </w:t>
+      </w:r>
+      <w:r>
+        <w:rPr>
+          <w:i/>
+          <w:iCs/>
+        </w:rPr>
+        <w:tab/>
+        <w:t xml:space="preserve">  </w:t>
+      </w:r>
+      <w:r>
+        <w:rPr>
+          <w:i/>
+          <w:iCs/>
+        </w:rPr>
+        <w:t>https://github.com/WilsenAL/CryptoSen-Intelligence</w:t>
       </w:r>
     </w:p>
     <w:p>
@@ -2190,6 +2450,9 @@
         <w:ind w:left="424" w:right="257"/>
         <w:jc w:val="both"/>
       </w:pPr>
+      <w:r>
+        <w:t>Developed an AI-powered cryptocurrency news media platform integrating Natural Language Processing (NLP) to analyze market sentiment, process real-time crypto news, and assist users in data-driven decision-making.</w:t>
+      </w:r>
     </w:p>
     <w:p>
       <w:pPr>
@@ -2198,6 +2461,12 @@
         <w:ind w:left="424" w:right="257"/>
         <w:jc w:val="both"/>
       </w:pPr>
+      <w:r>
+        <w:t xml:space="preserve">Link Access : </w:t>
+      </w:r>
+      <w:r>
+        <w:t>https://cryptosenintelligence.netlify.app</w:t>
+      </w:r>
     </w:p>
     <w:p>
       <w:pPr>
@@ -2481,41 +2750,12 @@
               </w:rPr>
               <w:t xml:space="preserve"> </w:t>
             </w:r>
-            <w:proofErr w:type="gramStart"/>
             <w:r>
               <w:rPr>
                 <w:spacing w:val="-5"/>
                 <w:sz w:val="20"/>
               </w:rPr>
-              <w:t xml:space="preserve">Swift, </w:t>
-            </w:r>
-            <w:r>
-              <w:rPr>
-                <w:spacing w:val="-5"/>
-                <w:sz w:val="20"/>
-              </w:rPr>
-              <w:t xml:space="preserve"> </w:t>
-            </w:r>
-            <w:r>
-              <w:rPr>
-                <w:spacing w:val="-5"/>
-                <w:sz w:val="20"/>
-              </w:rPr>
-              <w:t xml:space="preserve">Kotlin, </w:t>
-            </w:r>
-            <w:r>
-              <w:rPr>
-                <w:spacing w:val="-5"/>
-                <w:sz w:val="20"/>
-              </w:rPr>
-              <w:t xml:space="preserve"> </w:t>
-            </w:r>
-            <w:r>
-              <w:rPr>
-                <w:spacing w:val="-5"/>
-                <w:sz w:val="20"/>
-              </w:rPr>
-              <w:t>Flutter</w:t>
+              <w:t>Swift,  Kotlin,  Flutter</w:t>
             </w:r>
             <w:r>
               <w:rPr>
@@ -2527,14 +2767,7 @@
               <w:rPr>
                 <w:sz w:val="20"/>
               </w:rPr>
-              <w:t>Java</w:t>
-            </w:r>
-            <w:proofErr w:type="gramEnd"/>
-            <w:r>
-              <w:rPr>
-                <w:sz w:val="20"/>
-              </w:rPr>
-              <w:t>,</w:t>
+              <w:t>Java,</w:t>
             </w:r>
             <w:r>
               <w:rPr>
@@ -2686,6 +2919,18 @@
                 <w:sz w:val="20"/>
               </w:rPr>
               <w:t>Bootstrap</w:t>
+            </w:r>
+            <w:r>
+              <w:rPr>
+                <w:sz w:val="20"/>
+              </w:rPr>
+              <w:t xml:space="preserve">, </w:t>
+            </w:r>
+            <w:r>
+              <w:rPr>
+                <w:sz w:val="20"/>
+              </w:rPr>
+              <w:t>.NET Core</w:t>
             </w:r>
           </w:p>
         </w:tc>
@@ -2978,8 +3223,121 @@
 </file>
 
 <file path=word/numbering.xml><?xml version="1.0" encoding="utf-8"?>
-<w:numbering xmlns:wpc="http://schemas.microsoft.com/office/word/2010/wordprocessingCanvas" xmlns:cx="http://schemas.microsoft.com/office/drawing/2014/chartex" xmlns:cx1="http://schemas.microsoft.com/office/drawing/2015/9/8/chartex" xmlns:cx2="http://schemas.microsoft.com/office/drawing/2015/10/21/chartex" xmlns:cx3="http://schemas.microsoft.com/office/drawing/2016/5/9/chartex" xmlns:cx4="http://schemas.microsoft.com/office/drawing/2016/5/10/chartex" xmlns:cx5="http://schemas.microsoft.com/office/drawing/2016/5/11/chartex" xmlns:cx6="http://schemas.microsoft.com/office/drawing/2016/5/12/chartex" xmlns:cx7="http://schemas.microsoft.com/office/drawing/2016/5/13/chartex" xmlns:cx8="http://schemas.microsoft.com/office/drawing/2016/5/14/chartex" xmlns:mc="http://schemas.openxmlformats.org/markup-compatibility/2006" xmlns:aink="http://schemas.microsoft.com/office/drawing/2016/ink" xmlns:am3d="http://schemas.microsoft.com/office/drawing/2017/model3d" xmlns:o="urn:schemas-microsoft-com:office:office" xmlns:oel="http://schemas.microsoft.com/office/2019/extlst" xmlns:r="http://schemas.openxmlformats.org/officeDocument/2006/relationships" xmlns:m="http://schemas.openxmlformats.org/officeDocument/2006/math" xmlns:v="urn:schemas-microsoft-com:vml" xmlns:wp14="http://schemas.microsoft.com/office/word/2010/wordprocessingDrawing" xmlns:wp="http://schemas.openxmlformats.org/drawingml/2006/wordprocessingDrawing" xmlns:w10="urn:schemas-microsoft-com:office:word" xmlns:w="http://schemas.openxmlformats.org/wordprocessingml/2006/main" xmlns:w14="http://schemas.microsoft.com/office/word/2010/wordml" xmlns:w15="http://schemas.microsoft.com/office/word/2012/wordml" xmlns:w16cex="http://schemas.microsoft.com/office/word/2018/wordml/cex" xmlns:w16cid="http://schemas.microsoft.com/office/word/2016/wordml/cid" xmlns:w16="http://schemas.microsoft.com/office/word/2018/wordml" xmlns:w16du="http://schemas.microsoft.com/office/word/2023/wordml/word16du" xmlns:w16sdtdh="http://schemas.microsoft.com/office/word/2020/wordml/sdtdatahash" xmlns:w16sdtfl="http://schemas.microsoft.com/office/word/2024/wordml/sdtformatlock" xmlns:w16se="http://schemas.microsoft.com/office/word/2015/wordml/symex" xmlns:wpg="http://schemas.microsoft.com/office/word/2010/wordprocessingGroup" xmlns:wpi="http://schemas.microsoft.com/office/word/2010/wordprocessingInk" xmlns:wne="http://schemas.microsoft.com/office/word/2006/wordml" xmlns:wps="http://schemas.microsoft.com/office/word/2010/wordprocessingShape" mc:Ignorable="w14 w15 w16se w16cid w16 w16cex w16sdtdh w16sdtfl w16du wp14">
+<w:numbering xmlns:wpc="http://schemas.microsoft.com/office/word/2010/wordprocessingCanvas" xmlns:cx="http://schemas.microsoft.com/office/drawing/2014/chartex" xmlns:cx1="http://schemas.microsoft.com/office/drawing/2015/9/8/chartex" xmlns:cx2="http://schemas.microsoft.com/office/drawing/2015/10/21/chartex" xmlns:cx3="http://schemas.microsoft.com/office/drawing/2016/5/9/chartex" xmlns:cx4="http://schemas.microsoft.com/office/drawing/2016/5/10/chartex" xmlns:cx5="http://schemas.microsoft.com/office/drawing/2016/5/11/chartex" xmlns:cx6="http://schemas.microsoft.com/office/drawing/2016/5/12/chartex" xmlns:cx7="http://schemas.microsoft.com/office/drawing/2016/5/13/chartex" xmlns:cx8="http://schemas.microsoft.com/office/drawing/2016/5/14/chartex" xmlns:mc="http://schemas.openxmlformats.org/markup-compatibility/2006" xmlns:aink="http://schemas.microsoft.com/office/drawing/2016/ink" xmlns:am3d="http://schemas.microsoft.com/office/drawing/2017/model3d" xmlns:o="urn:schemas-microsoft-com:office:office" xmlns:oel="http://schemas.microsoft.com/office/2019/extlst" xmlns:r="http://schemas.openxmlformats.org/officeDocument/2006/relationships" xmlns:m="http://schemas.openxmlformats.org/officeDocument/2006/math" xmlns:v="urn:schemas-microsoft-com:vml" xmlns:wp14="http://schemas.microsoft.com/office/word/2010/wordprocessingDrawing" xmlns:wp="http://schemas.openxmlformats.org/drawingml/2006/wordprocessingDrawing" xmlns:w10="urn:schemas-microsoft-com:office:word" xmlns:w="http://schemas.openxmlformats.org/wordprocessingml/2006/main" xmlns:w14="http://schemas.microsoft.com/office/word/2010/wordml" xmlns:w15="http://schemas.microsoft.com/office/word/2012/wordml" xmlns:w16cei="http://schemas.microsoft.com/office/word/2026/wordml/cei" xmlns:w16cex="http://schemas.microsoft.com/office/word/2018/wordml/cex" xmlns:w16cid="http://schemas.microsoft.com/office/word/2016/wordml/cid" xmlns:w16="http://schemas.microsoft.com/office/word/2018/wordml" xmlns:w16du="http://schemas.microsoft.com/office/word/2023/wordml/word16du" xmlns:w16sdtdh="http://schemas.microsoft.com/office/word/2020/wordml/sdtdatahash" xmlns:w16sdtfl="http://schemas.microsoft.com/office/word/2024/wordml/sdtformatlock" xmlns:w16se="http://schemas.microsoft.com/office/word/2015/wordml/symex" xmlns:wpg="http://schemas.microsoft.com/office/word/2010/wordprocessingGroup" xmlns:wpi="http://schemas.microsoft.com/office/word/2010/wordprocessingInk" xmlns:wne="http://schemas.microsoft.com/office/word/2006/wordml" xmlns:wps="http://schemas.microsoft.com/office/word/2010/wordprocessingShape" mc:Ignorable="w14 w15 w16se w16cid w16 w16cex w16sdtdh w16sdtfl w16du wp14">
   <w:abstractNum w:abstractNumId="0" w15:restartNumberingAfterBreak="0">
+    <w:nsid w:val="19561E05"/>
+    <w:multiLevelType w:val="hybridMultilevel"/>
+    <w:tmpl w:val="94365D98"/>
+    <w:lvl w:ilvl="0" w:tplc="38090001">
+      <w:start w:val="1"/>
+      <w:numFmt w:val="bullet"/>
+      <w:lvlText w:val=""/>
+      <w:lvlJc w:val="left"/>
+      <w:pPr>
+        <w:ind w:left="1028" w:hanging="360"/>
+      </w:pPr>
+      <w:rPr>
+        <w:rFonts w:ascii="Symbol" w:hAnsi="Symbol" w:hint="default"/>
+      </w:rPr>
+    </w:lvl>
+    <w:lvl w:ilvl="1" w:tplc="38090003" w:tentative="1">
+      <w:start w:val="1"/>
+      <w:numFmt w:val="bullet"/>
+      <w:lvlText w:val="o"/>
+      <w:lvlJc w:val="left"/>
+      <w:pPr>
+        <w:ind w:left="1748" w:hanging="360"/>
+      </w:pPr>
+      <w:rPr>
+        <w:rFonts w:ascii="Courier New" w:hAnsi="Courier New" w:cs="Courier New" w:hint="default"/>
+      </w:rPr>
+    </w:lvl>
+    <w:lvl w:ilvl="2" w:tplc="38090005" w:tentative="1">
+      <w:start w:val="1"/>
+      <w:numFmt w:val="bullet"/>
+      <w:lvlText w:val=""/>
+      <w:lvlJc w:val="left"/>
+      <w:pPr>
+        <w:ind w:left="2468" w:hanging="360"/>
+      </w:pPr>
+      <w:rPr>
+        <w:rFonts w:ascii="Wingdings" w:hAnsi="Wingdings" w:hint="default"/>
+      </w:rPr>
+    </w:lvl>
+    <w:lvl w:ilvl="3" w:tplc="38090001" w:tentative="1">
+      <w:start w:val="1"/>
+      <w:numFmt w:val="bullet"/>
+      <w:lvlText w:val=""/>
+      <w:lvlJc w:val="left"/>
+      <w:pPr>
+        <w:ind w:left="3188" w:hanging="360"/>
+      </w:pPr>
+      <w:rPr>
+        <w:rFonts w:ascii="Symbol" w:hAnsi="Symbol" w:hint="default"/>
+      </w:rPr>
+    </w:lvl>
+    <w:lvl w:ilvl="4" w:tplc="38090003" w:tentative="1">
+      <w:start w:val="1"/>
+      <w:numFmt w:val="bullet"/>
+      <w:lvlText w:val="o"/>
+      <w:lvlJc w:val="left"/>
+      <w:pPr>
+        <w:ind w:left="3908" w:hanging="360"/>
+      </w:pPr>
+      <w:rPr>
+        <w:rFonts w:ascii="Courier New" w:hAnsi="Courier New" w:cs="Courier New" w:hint="default"/>
+      </w:rPr>
+    </w:lvl>
+    <w:lvl w:ilvl="5" w:tplc="38090005" w:tentative="1">
+      <w:start w:val="1"/>
+      <w:numFmt w:val="bullet"/>
+      <w:lvlText w:val=""/>
+      <w:lvlJc w:val="left"/>
+      <w:pPr>
+        <w:ind w:left="4628" w:hanging="360"/>
+      </w:pPr>
+      <w:rPr>
+        <w:rFonts w:ascii="Wingdings" w:hAnsi="Wingdings" w:hint="default"/>
+      </w:rPr>
+    </w:lvl>
+    <w:lvl w:ilvl="6" w:tplc="38090001" w:tentative="1">
+      <w:start w:val="1"/>
+      <w:numFmt w:val="bullet"/>
+      <w:lvlText w:val=""/>
+      <w:lvlJc w:val="left"/>
+      <w:pPr>
+        <w:ind w:left="5348" w:hanging="360"/>
+      </w:pPr>
+      <w:rPr>
+        <w:rFonts w:ascii="Symbol" w:hAnsi="Symbol" w:hint="default"/>
+      </w:rPr>
+    </w:lvl>
+    <w:lvl w:ilvl="7" w:tplc="38090003" w:tentative="1">
+      <w:start w:val="1"/>
+      <w:numFmt w:val="bullet"/>
+      <w:lvlText w:val="o"/>
+      <w:lvlJc w:val="left"/>
+      <w:pPr>
+        <w:ind w:left="6068" w:hanging="360"/>
+      </w:pPr>
+      <w:rPr>
+        <w:rFonts w:ascii="Courier New" w:hAnsi="Courier New" w:cs="Courier New" w:hint="default"/>
+      </w:rPr>
+    </w:lvl>
+    <w:lvl w:ilvl="8" w:tplc="38090005" w:tentative="1">
+      <w:start w:val="1"/>
+      <w:numFmt w:val="bullet"/>
+      <w:lvlText w:val=""/>
+      <w:lvlJc w:val="left"/>
+      <w:pPr>
+        <w:ind w:left="6788" w:hanging="360"/>
+      </w:pPr>
+      <w:rPr>
+        <w:rFonts w:ascii="Wingdings" w:hAnsi="Wingdings" w:hint="default"/>
+      </w:rPr>
+    </w:lvl>
+  </w:abstractNum>
+  <w:abstractNum w:abstractNumId="1" w15:restartNumberingAfterBreak="0">
     <w:nsid w:val="53F81B02"/>
     <w:multiLevelType w:val="hybridMultilevel"/>
     <w:tmpl w:val="FFFFFFFF"/>
@@ -3101,6 +3459,9 @@
     </w:lvl>
   </w:abstractNum>
   <w:num w:numId="1" w16cid:durableId="1436436656">
+    <w:abstractNumId w:val="1"/>
+  </w:num>
+  <w:num w:numId="2" w16cid:durableId="1253129240">
     <w:abstractNumId w:val="0"/>
   </w:num>
 </w:numbering>

</xml_diff>